<commit_message>
Completed Phase 1 :20k C4 documents ingested to Paraquet
</commit_message>
<xml_diff>
--- a/reports/Phase1_Report.docx
+++ b/reports/Phase1_Report.docx
@@ -97,13 +97,10 @@
           <w:p>
             <w:r>
               <w:rPr>
-                <w:i/>
-                <w:iCs/>
-                <w:color w:val="808080"/>
                 <w:sz w:val="21"/>
                 <w:szCs w:val="21"/>
               </w:rPr>
-              <w:t xml:space="preserve">[Your name]</w:t>
+              <w:t xml:space="preserve">Yash Pulapalli</w:t>
             </w:r>
           </w:p>
         </w:tc>
@@ -132,13 +129,10 @@
           <w:p>
             <w:r>
               <w:rPr>
-                <w:i/>
-                <w:iCs/>
-                <w:color w:val="808080"/>
                 <w:sz w:val="21"/>
                 <w:szCs w:val="21"/>
               </w:rPr>
-              <w:t xml:space="preserve">[Date this report was completed]</w:t>
+              <w:t xml:space="preserve">October 4, 2026</w:t>
             </w:r>
           </w:p>
         </w:tc>
@@ -167,13 +161,10 @@
           <w:p>
             <w:r>
               <w:rPr>
-                <w:i/>
-                <w:iCs/>
-                <w:color w:val="808080"/>
                 <w:sz w:val="21"/>
                 <w:szCs w:val="21"/>
               </w:rPr>
-              <w:t xml:space="preserve">[e.g., Session 3–5, Sept 20–Oct 3]</w:t>
+              <w:t xml:space="preserve">Phase 1 working session, October 4, 2026</w:t>
             </w:r>
           </w:p>
         </w:tc>
@@ -202,13 +193,10 @@
           <w:p>
             <w:r>
               <w:rPr>
-                <w:i/>
-                <w:iCs/>
-                <w:color w:val="808080"/>
                 <w:sz w:val="21"/>
                 <w:szCs w:val="21"/>
               </w:rPr>
-              <w:t xml:space="preserve">[Not started / In progress / Complete / Blocked]</w:t>
+              <w:t xml:space="preserve">Complete — 20,000 documents ingested to partitioned Parquet</w:t>
             </w:r>
           </w:p>
         </w:tc>
@@ -264,7 +252,7 @@
           <w:sz w:val="22"/>
           <w:szCs w:val="22"/>
         </w:rPr>
-        <w:t xml:space="preserve">☐  Identify and download raw text corpus/corpora to use as the base dataset</w:t>
+        <w:t xml:space="preserve">☑  Identify and download raw text corpus/corpora to use as the base dataset</w:t>
       </w:r>
     </w:p>
     <w:p>
@@ -281,7 +269,7 @@
           <w:sz w:val="22"/>
           <w:szCs w:val="22"/>
         </w:rPr>
-        <w:t xml:space="preserve">☐  Set up Apache Spark environment (local cluster, cloud cluster, or managed service)</w:t>
+        <w:t xml:space="preserve">☑  Set up Apache Spark environment (local cluster, cloud cluster, or managed service)</w:t>
       </w:r>
     </w:p>
     <w:p>
@@ -298,7 +286,7 @@
           <w:sz w:val="22"/>
           <w:szCs w:val="22"/>
         </w:rPr>
-        <w:t xml:space="preserve">☐  Define the Parquet storage schema and partitioning strategy</w:t>
+        <w:t xml:space="preserve">☑  Define the Parquet storage schema and partitioning strategy</w:t>
       </w:r>
     </w:p>
     <w:p>
@@ -315,7 +303,7 @@
           <w:sz w:val="22"/>
           <w:szCs w:val="22"/>
         </w:rPr>
-        <w:t xml:space="preserve">☐  Ingest raw data into partitioned Parquet format</w:t>
+        <w:t xml:space="preserve">☑  Ingest raw data into partitioned Parquet format</w:t>
       </w:r>
     </w:p>
     <w:p>
@@ -332,7 +320,7 @@
           <w:sz w:val="22"/>
           <w:szCs w:val="22"/>
         </w:rPr>
-        <w:t xml:space="preserve">☐  Validate the pipeline runs end-to-end on a small sample before scaling up</w:t>
+        <w:t xml:space="preserve">☑  Validate the pipeline runs end-to-end on a small sample before scaling up</w:t>
       </w:r>
     </w:p>
     <w:p>
@@ -349,18 +337,38 @@
     </w:p>
     <w:p>
       <w:pPr>
-        <w:shd w:fill="F2F2F2" w:val="clear"/>
-        <w:spacing w:after="160"/>
-      </w:pPr>
-      <w:r>
-        <w:rPr>
-          <w:i/>
-          <w:iCs/>
-          <w:color w:val="808080"/>
-          <w:sz w:val="21"/>
-          <w:szCs w:val="21"/>
-        </w:rPr>
-        <w:t xml:space="preserve">[Summarize, in your own words, what was actually built, run, or tested this session. Be specific: what code/pipeline components exist now, what data was processed, what scale (rows/GB/docs), and what changed from the plan, if anything.]</w:t>
+        <w:spacing w:after="140"/>
+      </w:pPr>
+      <w:r>
+        <w:rPr>
+          <w:sz w:val="22"/>
+          <w:szCs w:val="22"/>
+        </w:rPr>
+        <w:t xml:space="preserve">Built and ran the Phase 1 ingestion pipeline end to end on a local Windows machine. The pipeline streams documents from the public C4 corpus (allenai/c4, English config, train split) through HuggingFace datasets, loads them into an Apache Spark DataFrame, and writes them to data/raw/ as partitioned, Snappy-compressed Parquet.</w:t>
+      </w:r>
+    </w:p>
+    <w:p>
+      <w:pPr>
+        <w:spacing w:after="140"/>
+      </w:pPr>
+      <w:r>
+        <w:rPr>
+          <w:sz w:val="22"/>
+          <w:szCs w:val="22"/>
+        </w:rPr>
+        <w:t xml:space="preserve">Two runs were completed: a 500-document validation run to confirm the full path (stream, Spark, Parquet write) worked, followed by the real-scale run of 20,000 documents. Both finished with exit code 0, and the final run reported "Wrote 20,000 documents" to data/raw/.</w:t>
+      </w:r>
+    </w:p>
+    <w:p>
+      <w:pPr>
+        <w:spacing w:after="140"/>
+      </w:pPr>
+      <w:r>
+        <w:rPr>
+          <w:sz w:val="22"/>
+          <w:szCs w:val="22"/>
+        </w:rPr>
+        <w:t xml:space="preserve">Two reusable components now exist for later phases: ingest.py (command-line ingestion with --num-docs, --partitions, --dataset, --config and --split options) and spark_session.py (a shared Spark session factory that also auto-configures the Windows prerequisites described under Challenges).</w:t>
       </w:r>
     </w:p>
     <w:p>
@@ -377,27 +385,62 @@
     </w:p>
     <w:p>
       <w:pPr>
-        <w:shd w:fill="F2F2F2" w:val="clear"/>
-        <w:spacing w:after="160"/>
-      </w:pPr>
-      <w:r>
-        <w:rPr>
-          <w:i/>
-          <w:iCs/>
-          <w:color w:val="808080"/>
-          <w:sz w:val="21"/>
-          <w:szCs w:val="21"/>
-        </w:rPr>
-        <w:t xml:space="preserve">[Describe the technical approach taken this phase — design decisions, parameters/thresholds chosen, why, and any alternatives considered.]</w:t>
-      </w:r>
-    </w:p>
-    <w:p>
-      <w:pPr>
-        <w:pStyle w:val="Heading3"/>
-        <w:spacing w:after="80" w:before="200"/>
-      </w:pPr>
-      <w:r>
-        <w:t xml:space="preserve">Guiding questions to answer here:</w:t>
+        <w:spacing w:after="140"/>
+      </w:pPr>
+      <w:r>
+        <w:rPr>
+          <w:sz w:val="22"/>
+          <w:szCs w:val="22"/>
+        </w:rPr>
+        <w:t xml:space="preserve">Corpus choice: C4 (English) was chosen over an already heavily cleaned corpus such as WikiText because it still contains realistic near-duplicates, boilerplate and uneven-quality pages. That gives the Phase 2 filters and Phase 3 deduplication a visible, measurable effect. It is also far easier to work with than raw Common Crawl WARC files. Streaming means only the first N non-empty documents are pulled, not the full corpus (roughly 750 GB).</w:t>
+      </w:r>
+    </w:p>
+    <w:p>
+      <w:pPr>
+        <w:spacing w:after="140"/>
+      </w:pPr>
+      <w:r>
+        <w:rPr>
+          <w:sz w:val="22"/>
+          <w:szCs w:val="22"/>
+        </w:rPr>
+        <w:t xml:space="preserve">Schema: each record has three string columns: doc_id (a UUID assigned at ingestion), text (the document body, stripped; empty documents are skipped) and source (dataset/config name, so provenance survives when variants are combined later).</w:t>
+      </w:r>
+    </w:p>
+    <w:p>
+      <w:pPr>
+        <w:spacing w:after="140"/>
+      </w:pPr>
+      <w:r>
+        <w:rPr>
+          <w:sz w:val="22"/>
+          <w:szCs w:val="22"/>
+        </w:rPr>
+        <w:t xml:space="preserve">Storage layout: the DataFrame is repartitioned to 4 partitions and written in overwrite mode as Snappy Parquet. At this scale (tens of MB) the partition count only needs to give Spark some parallelism; the rule of thumb of 100–250 MB per file should be revisited if the corpus is scaled up.</w:t>
+      </w:r>
+    </w:p>
+    <w:p>
+      <w:pPr>
+        <w:spacing w:after="140"/>
+      </w:pPr>
+      <w:r>
+        <w:rPr>
+          <w:sz w:val="22"/>
+          <w:szCs w:val="22"/>
+        </w:rPr>
+        <w:t xml:space="preserve">Compute: Spark runs in local mode on a single laptop, as scoped in the project proposal, so no cluster is required. Validation proceeded from a small sample (500 documents) to the target scale (20,000) before any further scaling.</w:t>
+      </w:r>
+    </w:p>
+    <w:p>
+      <w:pPr>
+        <w:pStyle w:val="Heading2"/>
+        <w:spacing w:after="120" w:before="320"/>
+      </w:pPr>
+      <w:r>
+        <w:rPr>
+          <w:color w:val="2E5395"/>
+        </w:rPr>
+        <w:t xml:space="preserve">5. Tools &amp; Technologies Used</w:t>
       </w:r>
     </w:p>
     <w:p>
@@ -414,7 +457,7 @@
           <w:sz w:val="22"/>
           <w:szCs w:val="22"/>
         </w:rPr>
-        <w:t xml:space="preserve">What corpus/corpora did you choose, and why (size, licensing, diversity)?</w:t>
+        <w:t xml:space="preserve">Apache Spark (PySpark 4.x), local mode</w:t>
       </w:r>
     </w:p>
     <w:p>
@@ -431,7 +474,7 @@
           <w:sz w:val="22"/>
           <w:szCs w:val="22"/>
         </w:rPr>
-        <w:t xml:space="preserve">How is the data partitioned, and why that scheme?</w:t>
+        <w:t xml:space="preserve">Parquet (Snappy compression), partitioned output</w:t>
       </w:r>
     </w:p>
     <w:p>
@@ -448,19 +491,7 @@
           <w:sz w:val="22"/>
           <w:szCs w:val="22"/>
         </w:rPr>
-        <w:t xml:space="preserve">What is the baseline (unfiltered) dataset size in GB/tokens/documents?</w:t>
-      </w:r>
-    </w:p>
-    <w:p>
-      <w:pPr>
-        <w:pStyle w:val="Heading2"/>
-        <w:spacing w:after="120" w:before="320"/>
-      </w:pPr>
-      <w:r>
-        <w:rPr>
-          <w:color w:val="2E5395"/>
-        </w:rPr>
-        <w:t xml:space="preserve">5. Tools &amp; Technologies Used</w:t>
+        <w:t xml:space="preserve">HuggingFace datasets (streaming) with source data allenai/c4, English config</w:t>
       </w:r>
     </w:p>
     <w:p>
@@ -477,7 +508,724 @@
           <w:sz w:val="22"/>
           <w:szCs w:val="22"/>
         </w:rPr>
-        <w:t xml:space="preserve">Apache Spark (PySpark)</w:t>
+        <w:t xml:space="preserve">Python 3.13, OpenJDK 17 (Temurin), Hadoop winutils.exe and hadoop.dll (Windows), PyCharm, Git/GitHub</w:t>
+      </w:r>
+    </w:p>
+    <w:p>
+      <w:pPr>
+        <w:pStyle w:val="Heading2"/>
+        <w:spacing w:after="120" w:before="320"/>
+      </w:pPr>
+      <w:r>
+        <w:rPr>
+          <w:color w:val="2E5395"/>
+        </w:rPr>
+        <w:t xml:space="preserve">6. Results / Outputs</w:t>
+      </w:r>
+    </w:p>
+    <w:tbl>
+      <w:tblPr>
+        <w:tblW w:type="dxa" w:w="9350"/>
+        <w:tblBorders>
+          <w:top w:val="single" w:color="auto" w:sz="4"/>
+          <w:left w:val="single" w:color="auto" w:sz="4"/>
+          <w:bottom w:val="single" w:color="auto" w:sz="4"/>
+          <w:right w:val="single" w:color="auto" w:sz="4"/>
+          <w:insideH w:val="single" w:color="auto" w:sz="4"/>
+          <w:insideV w:val="single" w:color="auto" w:sz="4"/>
+        </w:tblBorders>
+      </w:tblPr>
+      <w:tblGrid>
+        <w:gridCol w:w="3000"/>
+        <w:gridCol w:w="2700"/>
+        <w:gridCol w:w="3650"/>
+      </w:tblGrid>
+      <w:tr>
+        <w:trPr>
+          <w:tblHeader/>
+        </w:trPr>
+        <w:tc>
+          <w:tcPr>
+            <w:tcW w:type="dxa" w:w="3000"/>
+            <w:shd w:fill="2E5395" w:val="clear"/>
+            <w:tcMar>
+              <w:top w:type="dxa" w:w="80"/>
+              <w:left w:type="dxa" w:w="100"/>
+              <w:bottom w:type="dxa" w:w="80"/>
+              <w:right w:type="dxa" w:w="100"/>
+            </w:tcMar>
+          </w:tcPr>
+          <w:p>
+            <w:r>
+              <w:rPr>
+                <w:b/>
+                <w:bCs/>
+                <w:color w:val="FFFFFF"/>
+                <w:sz w:val="20"/>
+                <w:szCs w:val="20"/>
+              </w:rPr>
+              <w:t xml:space="preserve">Metric</w:t>
+            </w:r>
+          </w:p>
+        </w:tc>
+        <w:tc>
+          <w:tcPr>
+            <w:tcW w:type="dxa" w:w="2700"/>
+            <w:shd w:fill="2E5395" w:val="clear"/>
+            <w:tcMar>
+              <w:top w:type="dxa" w:w="80"/>
+              <w:left w:type="dxa" w:w="100"/>
+              <w:bottom w:type="dxa" w:w="80"/>
+              <w:right w:type="dxa" w:w="100"/>
+            </w:tcMar>
+          </w:tcPr>
+          <w:p>
+            <w:r>
+              <w:rPr>
+                <w:b/>
+                <w:bCs/>
+                <w:color w:val="FFFFFF"/>
+                <w:sz w:val="20"/>
+                <w:szCs w:val="20"/>
+              </w:rPr>
+              <w:t xml:space="preserve">Value</w:t>
+            </w:r>
+          </w:p>
+        </w:tc>
+        <w:tc>
+          <w:tcPr>
+            <w:tcW w:type="dxa" w:w="3650"/>
+            <w:shd w:fill="2E5395" w:val="clear"/>
+            <w:tcMar>
+              <w:top w:type="dxa" w:w="80"/>
+              <w:left w:type="dxa" w:w="100"/>
+              <w:bottom w:type="dxa" w:w="80"/>
+              <w:right w:type="dxa" w:w="100"/>
+            </w:tcMar>
+          </w:tcPr>
+          <w:p>
+            <w:r>
+              <w:rPr>
+                <w:b/>
+                <w:bCs/>
+                <w:color w:val="FFFFFF"/>
+                <w:sz w:val="20"/>
+                <w:szCs w:val="20"/>
+              </w:rPr>
+              <w:t xml:space="preserve">Notes</w:t>
+            </w:r>
+          </w:p>
+        </w:tc>
+      </w:tr>
+      <w:tr>
+        <w:tc>
+          <w:tcPr>
+            <w:tcW w:type="dxa" w:w="3000"/>
+            <w:tcMar>
+              <w:top w:type="dxa" w:w="80"/>
+              <w:left w:type="dxa" w:w="100"/>
+              <w:bottom w:type="dxa" w:w="80"/>
+              <w:right w:type="dxa" w:w="100"/>
+            </w:tcMar>
+          </w:tcPr>
+          <w:p>
+            <w:r>
+              <w:rPr>
+                <w:b w:val="false"/>
+                <w:bCs w:val="false"/>
+                <w:color w:val="000000"/>
+                <w:sz w:val="20"/>
+                <w:szCs w:val="20"/>
+              </w:rPr>
+              <w:t xml:space="preserve">Source corpus</w:t>
+            </w:r>
+          </w:p>
+        </w:tc>
+        <w:tc>
+          <w:tcPr>
+            <w:tcW w:type="dxa" w:w="2700"/>
+            <w:tcMar>
+              <w:top w:type="dxa" w:w="80"/>
+              <w:left w:type="dxa" w:w="100"/>
+              <w:bottom w:type="dxa" w:w="80"/>
+              <w:right w:type="dxa" w:w="100"/>
+            </w:tcMar>
+          </w:tcPr>
+          <w:p>
+            <w:r>
+              <w:rPr>
+                <w:b w:val="false"/>
+                <w:bCs w:val="false"/>
+                <w:color w:val="000000"/>
+                <w:sz w:val="20"/>
+                <w:szCs w:val="20"/>
+              </w:rPr>
+              <w:t xml:space="preserve">allenai/c4 (en, train)</w:t>
+            </w:r>
+          </w:p>
+        </w:tc>
+        <w:tc>
+          <w:tcPr>
+            <w:tcW w:type="dxa" w:w="3650"/>
+            <w:tcMar>
+              <w:top w:type="dxa" w:w="80"/>
+              <w:left w:type="dxa" w:w="100"/>
+              <w:bottom w:type="dxa" w:w="80"/>
+              <w:right w:type="dxa" w:w="100"/>
+            </w:tcMar>
+          </w:tcPr>
+          <w:p>
+            <w:r>
+              <w:rPr>
+                <w:b w:val="false"/>
+                <w:bCs w:val="false"/>
+                <w:color w:val="000000"/>
+                <w:sz w:val="20"/>
+                <w:szCs w:val="20"/>
+              </w:rPr>
+              <w:t xml:space="preserve">Streamed; first 20,000 non-empty documents</w:t>
+            </w:r>
+          </w:p>
+        </w:tc>
+      </w:tr>
+      <w:tr>
+        <w:tc>
+          <w:tcPr>
+            <w:tcW w:type="dxa" w:w="3000"/>
+            <w:tcMar>
+              <w:top w:type="dxa" w:w="80"/>
+              <w:left w:type="dxa" w:w="100"/>
+              <w:bottom w:type="dxa" w:w="80"/>
+              <w:right w:type="dxa" w:w="100"/>
+            </w:tcMar>
+          </w:tcPr>
+          <w:p>
+            <w:r>
+              <w:rPr>
+                <w:b w:val="false"/>
+                <w:bCs w:val="false"/>
+                <w:color w:val="000000"/>
+                <w:sz w:val="20"/>
+                <w:szCs w:val="20"/>
+              </w:rPr>
+              <w:t xml:space="preserve">Documents ingested</w:t>
+            </w:r>
+          </w:p>
+        </w:tc>
+        <w:tc>
+          <w:tcPr>
+            <w:tcW w:type="dxa" w:w="2700"/>
+            <w:tcMar>
+              <w:top w:type="dxa" w:w="80"/>
+              <w:left w:type="dxa" w:w="100"/>
+              <w:bottom w:type="dxa" w:w="80"/>
+              <w:right w:type="dxa" w:w="100"/>
+            </w:tcMar>
+          </w:tcPr>
+          <w:p>
+            <w:r>
+              <w:rPr>
+                <w:b w:val="false"/>
+                <w:bCs w:val="false"/>
+                <w:color w:val="000000"/>
+                <w:sz w:val="20"/>
+                <w:szCs w:val="20"/>
+              </w:rPr>
+              <w:t xml:space="preserve">20,000</w:t>
+            </w:r>
+          </w:p>
+        </w:tc>
+        <w:tc>
+          <w:tcPr>
+            <w:tcW w:type="dxa" w:w="3650"/>
+            <w:tcMar>
+              <w:top w:type="dxa" w:w="80"/>
+              <w:left w:type="dxa" w:w="100"/>
+              <w:bottom w:type="dxa" w:w="80"/>
+              <w:right w:type="dxa" w:w="100"/>
+            </w:tcMar>
+          </w:tcPr>
+          <w:p>
+            <w:r>
+              <w:rPr>
+                <w:b w:val="false"/>
+                <w:bCs w:val="false"/>
+                <w:color w:val="000000"/>
+                <w:sz w:val="20"/>
+                <w:szCs w:val="20"/>
+              </w:rPr>
+              <w:t xml:space="preserve">Preceded by a 500-document validation run</w:t>
+            </w:r>
+          </w:p>
+        </w:tc>
+      </w:tr>
+      <w:tr>
+        <w:tc>
+          <w:tcPr>
+            <w:tcW w:type="dxa" w:w="3000"/>
+            <w:tcMar>
+              <w:top w:type="dxa" w:w="80"/>
+              <w:left w:type="dxa" w:w="100"/>
+              <w:bottom w:type="dxa" w:w="80"/>
+              <w:right w:type="dxa" w:w="100"/>
+            </w:tcMar>
+          </w:tcPr>
+          <w:p>
+            <w:r>
+              <w:rPr>
+                <w:b w:val="false"/>
+                <w:bCs w:val="false"/>
+                <w:color w:val="000000"/>
+                <w:sz w:val="20"/>
+                <w:szCs w:val="20"/>
+              </w:rPr>
+              <w:t xml:space="preserve">Parquet size on disk</w:t>
+            </w:r>
+          </w:p>
+        </w:tc>
+        <w:tc>
+          <w:tcPr>
+            <w:tcW w:type="dxa" w:w="2700"/>
+            <w:tcMar>
+              <w:top w:type="dxa" w:w="80"/>
+              <w:left w:type="dxa" w:w="100"/>
+              <w:bottom w:type="dxa" w:w="80"/>
+              <w:right w:type="dxa" w:w="100"/>
+            </w:tcMar>
+          </w:tcPr>
+          <w:p>
+            <w:r>
+              <w:rPr>
+                <w:b w:val="false"/>
+                <w:bCs w:val="false"/>
+                <w:color w:val="000000"/>
+                <w:sz w:val="20"/>
+                <w:szCs w:val="20"/>
+              </w:rPr>
+              <w:t xml:space="preserve">≈ 27.75 MB (27,750,122 bytes)</w:t>
+            </w:r>
+          </w:p>
+        </w:tc>
+        <w:tc>
+          <w:tcPr>
+            <w:tcW w:type="dxa" w:w="3650"/>
+            <w:tcMar>
+              <w:top w:type="dxa" w:w="80"/>
+              <w:left w:type="dxa" w:w="100"/>
+              <w:bottom w:type="dxa" w:w="80"/>
+              <w:right w:type="dxa" w:w="100"/>
+            </w:tcMar>
+          </w:tcPr>
+          <w:p>
+            <w:r>
+              <w:rPr>
+                <w:b w:val="false"/>
+                <w:bCs w:val="false"/>
+                <w:color w:val="000000"/>
+                <w:sz w:val="20"/>
+                <w:szCs w:val="20"/>
+              </w:rPr>
+              <w:t xml:space="preserve">Total of data/raw/, including 4 Parquet part files plus small Spark checksum and _SUCCESS files</w:t>
+            </w:r>
+          </w:p>
+        </w:tc>
+      </w:tr>
+      <w:tr>
+        <w:tc>
+          <w:tcPr>
+            <w:tcW w:type="dxa" w:w="3000"/>
+            <w:tcMar>
+              <w:top w:type="dxa" w:w="80"/>
+              <w:left w:type="dxa" w:w="100"/>
+              <w:bottom w:type="dxa" w:w="80"/>
+              <w:right w:type="dxa" w:w="100"/>
+            </w:tcMar>
+          </w:tcPr>
+          <w:p>
+            <w:r>
+              <w:rPr>
+                <w:b w:val="false"/>
+                <w:bCs w:val="false"/>
+                <w:color w:val="000000"/>
+                <w:sz w:val="20"/>
+                <w:szCs w:val="20"/>
+              </w:rPr>
+              <w:t xml:space="preserve">Avg. compressed size per document</w:t>
+            </w:r>
+          </w:p>
+        </w:tc>
+        <w:tc>
+          <w:tcPr>
+            <w:tcW w:type="dxa" w:w="2700"/>
+            <w:tcMar>
+              <w:top w:type="dxa" w:w="80"/>
+              <w:left w:type="dxa" w:w="100"/>
+              <w:bottom w:type="dxa" w:w="80"/>
+              <w:right w:type="dxa" w:w="100"/>
+            </w:tcMar>
+          </w:tcPr>
+          <w:p>
+            <w:r>
+              <w:rPr>
+                <w:b w:val="false"/>
+                <w:bCs w:val="false"/>
+                <w:color w:val="000000"/>
+                <w:sz w:val="20"/>
+                <w:szCs w:val="20"/>
+              </w:rPr>
+              <w:t xml:space="preserve">≈ 1.4 KB</w:t>
+            </w:r>
+          </w:p>
+        </w:tc>
+        <w:tc>
+          <w:tcPr>
+            <w:tcW w:type="dxa" w:w="3650"/>
+            <w:tcMar>
+              <w:top w:type="dxa" w:w="80"/>
+              <w:left w:type="dxa" w:w="100"/>
+              <w:bottom w:type="dxa" w:w="80"/>
+              <w:right w:type="dxa" w:w="100"/>
+            </w:tcMar>
+          </w:tcPr>
+          <w:p>
+            <w:r>
+              <w:rPr>
+                <w:b w:val="false"/>
+                <w:bCs w:val="false"/>
+                <w:color w:val="000000"/>
+                <w:sz w:val="20"/>
+                <w:szCs w:val="20"/>
+              </w:rPr>
+              <w:t xml:space="preserve">27,750,122 bytes / 20,000 documents (compressed, so not raw text length)</w:t>
+            </w:r>
+          </w:p>
+        </w:tc>
+      </w:tr>
+      <w:tr>
+        <w:tc>
+          <w:tcPr>
+            <w:tcW w:type="dxa" w:w="3000"/>
+            <w:tcMar>
+              <w:top w:type="dxa" w:w="80"/>
+              <w:left w:type="dxa" w:w="100"/>
+              <w:bottom w:type="dxa" w:w="80"/>
+              <w:right w:type="dxa" w:w="100"/>
+            </w:tcMar>
+          </w:tcPr>
+          <w:p>
+            <w:r>
+              <w:rPr>
+                <w:b w:val="false"/>
+                <w:bCs w:val="false"/>
+                <w:color w:val="000000"/>
+                <w:sz w:val="20"/>
+                <w:szCs w:val="20"/>
+              </w:rPr>
+              <w:t xml:space="preserve">Output layout</w:t>
+            </w:r>
+          </w:p>
+        </w:tc>
+        <w:tc>
+          <w:tcPr>
+            <w:tcW w:type="dxa" w:w="2700"/>
+            <w:tcMar>
+              <w:top w:type="dxa" w:w="80"/>
+              <w:left w:type="dxa" w:w="100"/>
+              <w:bottom w:type="dxa" w:w="80"/>
+              <w:right w:type="dxa" w:w="100"/>
+            </w:tcMar>
+          </w:tcPr>
+          <w:p>
+            <w:r>
+              <w:rPr>
+                <w:b w:val="false"/>
+                <w:bCs w:val="false"/>
+                <w:color w:val="000000"/>
+                <w:sz w:val="20"/>
+                <w:szCs w:val="20"/>
+              </w:rPr>
+              <w:t xml:space="preserve">4 partitions</w:t>
+            </w:r>
+          </w:p>
+        </w:tc>
+        <w:tc>
+          <w:tcPr>
+            <w:tcW w:type="dxa" w:w="3650"/>
+            <w:tcMar>
+              <w:top w:type="dxa" w:w="80"/>
+              <w:left w:type="dxa" w:w="100"/>
+              <w:bottom w:type="dxa" w:w="80"/>
+              <w:right w:type="dxa" w:w="100"/>
+            </w:tcMar>
+          </w:tcPr>
+          <w:p>
+            <w:r>
+              <w:rPr>
+                <w:b w:val="false"/>
+                <w:bCs w:val="false"/>
+                <w:color w:val="000000"/>
+                <w:sz w:val="20"/>
+                <w:szCs w:val="20"/>
+              </w:rPr>
+              <w:t xml:space="preserve">Snappy-compressed Parquet in data/raw/</w:t>
+            </w:r>
+          </w:p>
+        </w:tc>
+      </w:tr>
+      <w:tr>
+        <w:tc>
+          <w:tcPr>
+            <w:tcW w:type="dxa" w:w="3000"/>
+            <w:tcMar>
+              <w:top w:type="dxa" w:w="80"/>
+              <w:left w:type="dxa" w:w="100"/>
+              <w:bottom w:type="dxa" w:w="80"/>
+              <w:right w:type="dxa" w:w="100"/>
+            </w:tcMar>
+          </w:tcPr>
+          <w:p>
+            <w:r>
+              <w:rPr>
+                <w:b w:val="false"/>
+                <w:bCs w:val="false"/>
+                <w:color w:val="000000"/>
+                <w:sz w:val="20"/>
+                <w:szCs w:val="20"/>
+              </w:rPr>
+              <w:t xml:space="preserve">Raw text size and token count</w:t>
+            </w:r>
+          </w:p>
+        </w:tc>
+        <w:tc>
+          <w:tcPr>
+            <w:tcW w:type="dxa" w:w="2700"/>
+            <w:tcMar>
+              <w:top w:type="dxa" w:w="80"/>
+              <w:left w:type="dxa" w:w="100"/>
+              <w:bottom w:type="dxa" w:w="80"/>
+              <w:right w:type="dxa" w:w="100"/>
+            </w:tcMar>
+          </w:tcPr>
+          <w:p>
+            <w:r>
+              <w:rPr>
+                <w:b w:val="false"/>
+                <w:bCs w:val="false"/>
+                <w:color w:val="000000"/>
+                <w:sz w:val="20"/>
+                <w:szCs w:val="20"/>
+              </w:rPr>
+              <w:t xml:space="preserve">Not yet measured</w:t>
+            </w:r>
+          </w:p>
+        </w:tc>
+        <w:tc>
+          <w:tcPr>
+            <w:tcW w:type="dxa" w:w="3650"/>
+            <w:tcMar>
+              <w:top w:type="dxa" w:w="80"/>
+              <w:left w:type="dxa" w:w="100"/>
+              <w:bottom w:type="dxa" w:w="80"/>
+              <w:right w:type="dxa" w:w="100"/>
+            </w:tcMar>
+          </w:tcPr>
+          <w:p>
+            <w:r>
+              <w:rPr>
+                <w:b w:val="false"/>
+                <w:bCs w:val="false"/>
+                <w:color w:val="000000"/>
+                <w:sz w:val="20"/>
+                <w:szCs w:val="20"/>
+              </w:rPr>
+              <w:t xml:space="preserve">To be computed as the baseline at the start of Phase 2</w:t>
+            </w:r>
+          </w:p>
+        </w:tc>
+      </w:tr>
+      <w:tr>
+        <w:tc>
+          <w:tcPr>
+            <w:tcW w:type="dxa" w:w="3000"/>
+            <w:tcMar>
+              <w:top w:type="dxa" w:w="80"/>
+              <w:left w:type="dxa" w:w="100"/>
+              <w:bottom w:type="dxa" w:w="80"/>
+              <w:right w:type="dxa" w:w="100"/>
+            </w:tcMar>
+          </w:tcPr>
+          <w:p>
+            <w:r>
+              <w:rPr>
+                <w:b w:val="false"/>
+                <w:bCs w:val="false"/>
+                <w:color w:val="000000"/>
+                <w:sz w:val="20"/>
+                <w:szCs w:val="20"/>
+              </w:rPr>
+              <w:t xml:space="preserve">Ingestion runtime</w:t>
+            </w:r>
+          </w:p>
+        </w:tc>
+        <w:tc>
+          <w:tcPr>
+            <w:tcW w:type="dxa" w:w="2700"/>
+            <w:tcMar>
+              <w:top w:type="dxa" w:w="80"/>
+              <w:left w:type="dxa" w:w="100"/>
+              <w:bottom w:type="dxa" w:w="80"/>
+              <w:right w:type="dxa" w:w="100"/>
+            </w:tcMar>
+          </w:tcPr>
+          <w:p>
+            <w:r>
+              <w:rPr>
+                <w:b w:val="false"/>
+                <w:bCs w:val="false"/>
+                <w:color w:val="000000"/>
+                <w:sz w:val="20"/>
+                <w:szCs w:val="20"/>
+              </w:rPr>
+              <w:t xml:space="preserve">Not recorded</w:t>
+            </w:r>
+          </w:p>
+        </w:tc>
+        <w:tc>
+          <w:tcPr>
+            <w:tcW w:type="dxa" w:w="3650"/>
+            <w:tcMar>
+              <w:top w:type="dxa" w:w="80"/>
+              <w:left w:type="dxa" w:w="100"/>
+              <w:bottom w:type="dxa" w:w="80"/>
+              <w:right w:type="dxa" w:w="100"/>
+            </w:tcMar>
+          </w:tcPr>
+          <w:p>
+            <w:r>
+              <w:rPr>
+                <w:b w:val="false"/>
+                <w:bCs w:val="false"/>
+                <w:color w:val="000000"/>
+                <w:sz w:val="20"/>
+                <w:szCs w:val="20"/>
+              </w:rPr>
+              <w:t xml:space="preserve">Timing was not captured; add it if needed for the final report</w:t>
+            </w:r>
+          </w:p>
+        </w:tc>
+      </w:tr>
+    </w:tbl>
+    <w:p>
+      <w:pPr>
+        <w:spacing w:after="160"/>
+      </w:pPr>
+    </w:p>
+    <w:p>
+      <w:pPr>
+        <w:pStyle w:val="Heading2"/>
+        <w:spacing w:after="120" w:before="320"/>
+      </w:pPr>
+      <w:r>
+        <w:rPr>
+          <w:color w:val="2E5395"/>
+        </w:rPr>
+        <w:t xml:space="preserve">7. Challenges &amp; Issues Encountered</w:t>
+      </w:r>
+    </w:p>
+    <w:p>
+      <w:pPr>
+        <w:pStyle w:val="Heading3"/>
+        <w:spacing w:after="80" w:before="200"/>
+      </w:pPr>
+      <w:r>
+        <w:t xml:space="preserve">Java not found by Spark</w:t>
+      </w:r>
+    </w:p>
+    <w:p>
+      <w:pPr>
+        <w:spacing w:after="140"/>
+      </w:pPr>
+      <w:r>
+        <w:rPr>
+          <w:sz w:val="22"/>
+          <w:szCs w:val="22"/>
+        </w:rPr>
+        <w:t xml:space="preserve">Installing JDK 17 with winget initially failed (error 1618, another installer running) and, once installed, the java command was still not recognized in PowerShell and PyCharm despite a correct-looking PATH. Resolved by adding automatic JAVA_HOME detection to spark_session.py, which finds an installed JDK and sets JAVA_HOME and PATH for the process.</w:t>
+      </w:r>
+    </w:p>
+    <w:p>
+      <w:pPr>
+        <w:pStyle w:val="Heading3"/>
+        <w:spacing w:after="80" w:before="200"/>
+      </w:pPr>
+      <w:r>
+        <w:t xml:space="preserve">Python worker failed to connect back</w:t>
+      </w:r>
+    </w:p>
+    <w:p>
+      <w:pPr>
+        <w:spacing w:after="140"/>
+      </w:pPr>
+      <w:r>
+        <w:rPr>
+          <w:sz w:val="22"/>
+          <w:szCs w:val="22"/>
+        </w:rPr>
+        <w:t xml:space="preserve">Spark's Python workers launched the Microsoft Store python alias ("Python was not found") instead of the real interpreter. Resolved by setting PYSPARK_PYTHON and PYSPARK_DRIVER_PYTHON to the interpreter that is running the script.</w:t>
+      </w:r>
+    </w:p>
+    <w:p>
+      <w:pPr>
+        <w:pStyle w:val="Heading3"/>
+        <w:spacing w:after="80" w:before="200"/>
+      </w:pPr>
+      <w:r>
+        <w:t xml:space="preserve">Hadoop on Windows: winutils and hadoop.dll</w:t>
+      </w:r>
+    </w:p>
+    <w:p>
+      <w:pPr>
+        <w:spacing w:after="140"/>
+      </w:pPr>
+      <w:r>
+        <w:rPr>
+          <w:sz w:val="22"/>
+          <w:szCs w:val="22"/>
+        </w:rPr>
+        <w:t xml:space="preserve">The Parquet write first failed with "HADOOP_HOME and hadoop.home.dir are unset", then with an UnsatisfiedLinkError in NativeIO. Both are Windows-only requirements of Spark's Hadoop file layer. Resolved by installing winutils.exe and hadoop.dll into C:\hadoop\bin and having spark_session.py set HADOOP_HOME and add that folder to PATH.</w:t>
+      </w:r>
+    </w:p>
+    <w:p>
+      <w:pPr>
+        <w:pStyle w:val="Heading3"/>
+        <w:spacing w:after="80" w:before="200"/>
+      </w:pPr>
+      <w:r>
+        <w:t xml:space="preserve">Warnings that did not need fixing</w:t>
+      </w:r>
+    </w:p>
+    <w:p>
+      <w:pPr>
+        <w:spacing w:after="140"/>
+      </w:pPr>
+      <w:r>
+        <w:rPr>
+          <w:sz w:val="22"/>
+          <w:szCs w:val="22"/>
+        </w:rPr>
+        <w:t xml:space="preserve">A pandas 3.0 compatibility warning from PySpark, an unauthenticated HuggingFace Hub notice, a Parquet memory-manager warning (resolved by using fewer partitions), and a "task of very large size" warning because documents are collected on the driver before createDataFrame. All are harmless at 20,000 documents.</w:t>
+      </w:r>
+    </w:p>
+    <w:p>
+      <w:pPr>
+        <w:pStyle w:val="Heading2"/>
+        <w:spacing w:after="120" w:before="320"/>
+      </w:pPr>
+      <w:r>
+        <w:rPr>
+          <w:color w:val="2E5395"/>
+        </w:rPr>
+        <w:t xml:space="preserve">8. Key Learnings</w:t>
       </w:r>
     </w:p>
     <w:p>
@@ -494,7 +1242,7 @@
           <w:sz w:val="22"/>
           <w:szCs w:val="22"/>
         </w:rPr>
-        <w:t xml:space="preserve">Parquet / columnar storage</w:t>
+        <w:t xml:space="preserve">Spark on Windows needs more setup than on Linux or macOS: a JDK, correct Python interpreter paths, and Hadoop's winutils.exe and hadoop.dll. Encoding that setup in one shared spark_session.py means later phases inherit it without repeating the work.</w:t>
       </w:r>
     </w:p>
     <w:p>
@@ -511,7 +1259,7 @@
           <w:sz w:val="22"/>
           <w:szCs w:val="22"/>
         </w:rPr>
-        <w:t xml:space="preserve">Cloud or local compute cluster</w:t>
+        <w:t xml:space="preserve">Validating with a small sample (500 documents) first made each environment failure quick to isolate before spending time on the full 20,000-document run.</w:t>
       </w:r>
     </w:p>
     <w:p>
@@ -528,7 +1276,24 @@
           <w:sz w:val="22"/>
           <w:szCs w:val="22"/>
         </w:rPr>
-        <w:t xml:space="preserve">Source data: [name the corpus/corpora, e.g., Common Crawl subset, Wikipedia dump, etc.]</w:t>
+        <w:t xml:space="preserve">Streaming a public corpus avoids a large download. The current design collects documents into a Python list on the driver, which is fine at this scale but will not hold for millions of documents; scaling up would need a different ingestion path (for example, writing batches straight to Parquet with pyarrow).</w:t>
+      </w:r>
+    </w:p>
+    <w:p>
+      <w:pPr>
+        <w:pStyle w:val="ListParagraph"/>
+        <w:numPr>
+          <w:ilvl w:val="0"/>
+          <w:numId w:val="2"/>
+        </w:numPr>
+        <w:spacing w:after="60"/>
+      </w:pPr>
+      <w:r>
+        <w:rPr>
+          <w:sz w:val="22"/>
+          <w:szCs w:val="22"/>
+        </w:rPr>
+        <w:t xml:space="preserve">Reading one error at a time and fixing the root cause (rather than working around symptoms) kept debugging manageable; each fix was documented in code so the environment is reproducible.</w:t>
       </w:r>
     </w:p>
     <w:p>
@@ -540,7 +1305,7 @@
         <w:rPr>
           <w:color w:val="2E5395"/>
         </w:rPr>
-        <w:t xml:space="preserve">6. Results / Outputs</w:t>
+        <w:t xml:space="preserve">9. Status Summary</w:t>
       </w:r>
     </w:p>
     <w:tbl>
@@ -584,7 +1349,7 @@
                 <w:sz w:val="20"/>
                 <w:szCs w:val="20"/>
               </w:rPr>
-              <w:t xml:space="preserve">Metric</w:t>
+              <w:t xml:space="preserve">Status</w:t>
             </w:r>
           </w:p>
         </w:tc>
@@ -608,7 +1373,7 @@
                 <w:sz w:val="20"/>
                 <w:szCs w:val="20"/>
               </w:rPr>
-              <w:t xml:space="preserve">Value</w:t>
+              <w:t xml:space="preserve">On track?</w:t>
             </w:r>
           </w:p>
         </w:tc>
@@ -632,7 +1397,7 @@
                 <w:sz w:val="20"/>
                 <w:szCs w:val="20"/>
               </w:rPr>
-              <w:t xml:space="preserve">Notes</w:t>
+              <w:t xml:space="preserve">Comments</w:t>
             </w:r>
           </w:p>
         </w:tc>
@@ -657,7 +1422,7 @@
                 <w:sz w:val="20"/>
                 <w:szCs w:val="20"/>
               </w:rPr>
-              <w:t xml:space="preserve">[e.g., raw data volume]</w:t>
+              <w:t xml:space="preserve">Complete</w:t>
             </w:r>
           </w:p>
         </w:tc>
@@ -680,7 +1445,7 @@
                 <w:sz w:val="20"/>
                 <w:szCs w:val="20"/>
               </w:rPr>
-              <w:t xml:space="preserve">[value]</w:t>
+              <w:t xml:space="preserve">Yes</w:t>
             </w:r>
           </w:p>
         </w:tc>
@@ -703,220 +1468,7 @@
                 <w:sz w:val="20"/>
                 <w:szCs w:val="20"/>
               </w:rPr>
-              <w:t xml:space="preserve">[notes]</w:t>
-            </w:r>
-          </w:p>
-        </w:tc>
-      </w:tr>
-      <w:tr>
-        <w:tc>
-          <w:tcPr>
-            <w:tcW w:type="dxa" w:w="3300"/>
-            <w:tcMar>
-              <w:top w:type="dxa" w:w="80"/>
-              <w:left w:type="dxa" w:w="100"/>
-              <w:bottom w:type="dxa" w:w="80"/>
-              <w:right w:type="dxa" w:w="100"/>
-            </w:tcMar>
-          </w:tcPr>
-          <w:p>
-            <w:r>
-              <w:rPr>
-                <w:b w:val="false"/>
-                <w:bCs w:val="false"/>
-                <w:color w:val="000000"/>
-                <w:sz w:val="20"/>
-                <w:szCs w:val="20"/>
-              </w:rPr>
-              <w:t xml:space="preserve">[e.g., processing time]</w:t>
-            </w:r>
-          </w:p>
-        </w:tc>
-        <w:tc>
-          <w:tcPr>
-            <w:tcW w:type="dxa" w:w="2500"/>
-            <w:tcMar>
-              <w:top w:type="dxa" w:w="80"/>
-              <w:left w:type="dxa" w:w="100"/>
-              <w:bottom w:type="dxa" w:w="80"/>
-              <w:right w:type="dxa" w:w="100"/>
-            </w:tcMar>
-          </w:tcPr>
-          <w:p>
-            <w:r>
-              <w:rPr>
-                <w:b w:val="false"/>
-                <w:bCs w:val="false"/>
-                <w:color w:val="000000"/>
-                <w:sz w:val="20"/>
-                <w:szCs w:val="20"/>
-              </w:rPr>
-              <w:t xml:space="preserve">[value]</w:t>
-            </w:r>
-          </w:p>
-        </w:tc>
-        <w:tc>
-          <w:tcPr>
-            <w:tcW w:type="dxa" w:w="3550"/>
-            <w:tcMar>
-              <w:top w:type="dxa" w:w="80"/>
-              <w:left w:type="dxa" w:w="100"/>
-              <w:bottom w:type="dxa" w:w="80"/>
-              <w:right w:type="dxa" w:w="100"/>
-            </w:tcMar>
-          </w:tcPr>
-          <w:p>
-            <w:r>
-              <w:rPr>
-                <w:b w:val="false"/>
-                <w:bCs w:val="false"/>
-                <w:color w:val="000000"/>
-                <w:sz w:val="20"/>
-                <w:szCs w:val="20"/>
-              </w:rPr>
-              <w:t xml:space="preserve">[notes]</w:t>
-            </w:r>
-          </w:p>
-        </w:tc>
-      </w:tr>
-      <w:tr>
-        <w:tc>
-          <w:tcPr>
-            <w:tcW w:type="dxa" w:w="3300"/>
-            <w:tcMar>
-              <w:top w:type="dxa" w:w="80"/>
-              <w:left w:type="dxa" w:w="100"/>
-              <w:bottom w:type="dxa" w:w="80"/>
-              <w:right w:type="dxa" w:w="100"/>
-            </w:tcMar>
-          </w:tcPr>
-          <w:p>
-            <w:r>
-              <w:rPr>
-                <w:b w:val="false"/>
-                <w:bCs w:val="false"/>
-                <w:color w:val="000000"/>
-                <w:sz w:val="20"/>
-                <w:szCs w:val="20"/>
-              </w:rPr>
-              <w:t xml:space="preserve">[e.g., records in / out]</w:t>
-            </w:r>
-          </w:p>
-        </w:tc>
-        <w:tc>
-          <w:tcPr>
-            <w:tcW w:type="dxa" w:w="2500"/>
-            <w:tcMar>
-              <w:top w:type="dxa" w:w="80"/>
-              <w:left w:type="dxa" w:w="100"/>
-              <w:bottom w:type="dxa" w:w="80"/>
-              <w:right w:type="dxa" w:w="100"/>
-            </w:tcMar>
-          </w:tcPr>
-          <w:p>
-            <w:r>
-              <w:rPr>
-                <w:b w:val="false"/>
-                <w:bCs w:val="false"/>
-                <w:color w:val="000000"/>
-                <w:sz w:val="20"/>
-                <w:szCs w:val="20"/>
-              </w:rPr>
-              <w:t xml:space="preserve">[value]</w:t>
-            </w:r>
-          </w:p>
-        </w:tc>
-        <w:tc>
-          <w:tcPr>
-            <w:tcW w:type="dxa" w:w="3550"/>
-            <w:tcMar>
-              <w:top w:type="dxa" w:w="80"/>
-              <w:left w:type="dxa" w:w="100"/>
-              <w:bottom w:type="dxa" w:w="80"/>
-              <w:right w:type="dxa" w:w="100"/>
-            </w:tcMar>
-          </w:tcPr>
-          <w:p>
-            <w:r>
-              <w:rPr>
-                <w:b w:val="false"/>
-                <w:bCs w:val="false"/>
-                <w:color w:val="000000"/>
-                <w:sz w:val="20"/>
-                <w:szCs w:val="20"/>
-              </w:rPr>
-              <w:t xml:space="preserve">[notes]</w:t>
-            </w:r>
-          </w:p>
-        </w:tc>
-      </w:tr>
-      <w:tr>
-        <w:tc>
-          <w:tcPr>
-            <w:tcW w:type="dxa" w:w="3300"/>
-            <w:tcMar>
-              <w:top w:type="dxa" w:w="80"/>
-              <w:left w:type="dxa" w:w="100"/>
-              <w:bottom w:type="dxa" w:w="80"/>
-              <w:right w:type="dxa" w:w="100"/>
-            </w:tcMar>
-          </w:tcPr>
-          <w:p>
-            <w:r>
-              <w:rPr>
-                <w:b w:val="false"/>
-                <w:bCs w:val="false"/>
-                <w:color w:val="000000"/>
-                <w:sz w:val="20"/>
-                <w:szCs w:val="20"/>
-              </w:rPr>
-              <w:t xml:space="preserve">[add rows as needed]</w:t>
-            </w:r>
-          </w:p>
-        </w:tc>
-        <w:tc>
-          <w:tcPr>
-            <w:tcW w:type="dxa" w:w="2500"/>
-            <w:tcMar>
-              <w:top w:type="dxa" w:w="80"/>
-              <w:left w:type="dxa" w:w="100"/>
-              <w:bottom w:type="dxa" w:w="80"/>
-              <w:right w:type="dxa" w:w="100"/>
-            </w:tcMar>
-          </w:tcPr>
-          <w:p>
-            <w:r>
-              <w:rPr>
-                <w:b w:val="false"/>
-                <w:bCs w:val="false"/>
-                <w:color w:val="000000"/>
-                <w:sz w:val="20"/>
-                <w:szCs w:val="20"/>
-              </w:rPr>
-              <w:t xml:space="preserve"/>
-            </w:r>
-          </w:p>
-        </w:tc>
-        <w:tc>
-          <w:tcPr>
-            <w:tcW w:type="dxa" w:w="3550"/>
-            <w:tcMar>
-              <w:top w:type="dxa" w:w="80"/>
-              <w:left w:type="dxa" w:w="100"/>
-              <w:bottom w:type="dxa" w:w="80"/>
-              <w:right w:type="dxa" w:w="100"/>
-            </w:tcMar>
-          </w:tcPr>
-          <w:p>
-            <w:r>
-              <w:rPr>
-                <w:b w:val="false"/>
-                <w:bCs w:val="false"/>
-                <w:color w:val="000000"/>
-                <w:sz w:val="20"/>
-                <w:szCs w:val="20"/>
-              </w:rPr>
-              <w:t xml:space="preserve"/>
+              <w:t xml:space="preserve">All planned Phase 1 tasks done; raw dataset is ready for Phase 2.</w:t>
             </w:r>
           </w:p>
         </w:tc>
@@ -936,262 +1488,31 @@
         <w:rPr>
           <w:color w:val="2E5395"/>
         </w:rPr>
-        <w:t xml:space="preserve">7. Challenges &amp; Issues Encountered</w:t>
-      </w:r>
-    </w:p>
-    <w:p>
-      <w:pPr>
-        <w:shd w:fill="F2F2F2" w:val="clear"/>
-        <w:spacing w:after="160"/>
-      </w:pPr>
-      <w:r>
-        <w:rPr>
-          <w:i/>
-          <w:iCs/>
-          <w:color w:val="808080"/>
-          <w:sz w:val="21"/>
-          <w:szCs w:val="21"/>
-        </w:rPr>
-        <w:t xml:space="preserve">[What broke, what was harder than expected, what you had to debug or redesign, and how you resolved it — or if it's still open.]</w:t>
-      </w:r>
-    </w:p>
-    <w:p>
-      <w:pPr>
-        <w:pStyle w:val="Heading2"/>
-        <w:spacing w:after="120" w:before="320"/>
-      </w:pPr>
-      <w:r>
-        <w:rPr>
-          <w:color w:val="2E5395"/>
-        </w:rPr>
-        <w:t xml:space="preserve">8. Key Learnings</w:t>
-      </w:r>
-    </w:p>
-    <w:p>
-      <w:pPr>
-        <w:shd w:fill="F2F2F2" w:val="clear"/>
-        <w:spacing w:after="160"/>
-      </w:pPr>
-      <w:r>
-        <w:rPr>
-          <w:i/>
-          <w:iCs/>
-          <w:color w:val="808080"/>
-          <w:sz w:val="21"/>
-          <w:szCs w:val="21"/>
-        </w:rPr>
-        <w:t xml:space="preserve">[What you learned technically (e.g., about Spark, hashing, LSH tuning) and, if relevant, about planning/scoping/prioritizing this piece of work.]</w:t>
-      </w:r>
-    </w:p>
-    <w:p>
-      <w:pPr>
-        <w:pStyle w:val="Heading2"/>
-        <w:spacing w:after="120" w:before="320"/>
-      </w:pPr>
-      <w:r>
-        <w:rPr>
-          <w:color w:val="2E5395"/>
-        </w:rPr>
-        <w:t xml:space="preserve">9. Status Summary</w:t>
-      </w:r>
-    </w:p>
-    <w:tbl>
-      <w:tblPr>
-        <w:tblW w:type="dxa" w:w="9350"/>
-        <w:tblBorders>
-          <w:top w:val="single" w:color="auto" w:sz="4"/>
-          <w:left w:val="single" w:color="auto" w:sz="4"/>
-          <w:bottom w:val="single" w:color="auto" w:sz="4"/>
-          <w:right w:val="single" w:color="auto" w:sz="4"/>
-          <w:insideH w:val="single" w:color="auto" w:sz="4"/>
-          <w:insideV w:val="single" w:color="auto" w:sz="4"/>
-        </w:tblBorders>
-      </w:tblPr>
-      <w:tblGrid>
-        <w:gridCol w:w="3300"/>
-        <w:gridCol w:w="2500"/>
-        <w:gridCol w:w="3550"/>
-      </w:tblGrid>
-      <w:tr>
-        <w:trPr>
-          <w:tblHeader/>
-        </w:trPr>
-        <w:tc>
-          <w:tcPr>
-            <w:tcW w:type="dxa" w:w="3300"/>
-            <w:shd w:fill="2E5395" w:val="clear"/>
-            <w:tcMar>
-              <w:top w:type="dxa" w:w="80"/>
-              <w:left w:type="dxa" w:w="100"/>
-              <w:bottom w:type="dxa" w:w="80"/>
-              <w:right w:type="dxa" w:w="100"/>
-            </w:tcMar>
-          </w:tcPr>
-          <w:p>
-            <w:r>
-              <w:rPr>
-                <w:b/>
-                <w:bCs/>
-                <w:color w:val="FFFFFF"/>
-                <w:sz w:val="20"/>
-                <w:szCs w:val="20"/>
-              </w:rPr>
-              <w:t xml:space="preserve">Status</w:t>
-            </w:r>
-          </w:p>
-        </w:tc>
-        <w:tc>
-          <w:tcPr>
-            <w:tcW w:type="dxa" w:w="2500"/>
-            <w:shd w:fill="2E5395" w:val="clear"/>
-            <w:tcMar>
-              <w:top w:type="dxa" w:w="80"/>
-              <w:left w:type="dxa" w:w="100"/>
-              <w:bottom w:type="dxa" w:w="80"/>
-              <w:right w:type="dxa" w:w="100"/>
-            </w:tcMar>
-          </w:tcPr>
-          <w:p>
-            <w:r>
-              <w:rPr>
-                <w:b/>
-                <w:bCs/>
-                <w:color w:val="FFFFFF"/>
-                <w:sz w:val="20"/>
-                <w:szCs w:val="20"/>
-              </w:rPr>
-              <w:t xml:space="preserve">On track?</w:t>
-            </w:r>
-          </w:p>
-        </w:tc>
-        <w:tc>
-          <w:tcPr>
-            <w:tcW w:type="dxa" w:w="3550"/>
-            <w:shd w:fill="2E5395" w:val="clear"/>
-            <w:tcMar>
-              <w:top w:type="dxa" w:w="80"/>
-              <w:left w:type="dxa" w:w="100"/>
-              <w:bottom w:type="dxa" w:w="80"/>
-              <w:right w:type="dxa" w:w="100"/>
-            </w:tcMar>
-          </w:tcPr>
-          <w:p>
-            <w:r>
-              <w:rPr>
-                <w:b/>
-                <w:bCs/>
-                <w:color w:val="FFFFFF"/>
-                <w:sz w:val="20"/>
-                <w:szCs w:val="20"/>
-              </w:rPr>
-              <w:t xml:space="preserve">Comments</w:t>
-            </w:r>
-          </w:p>
-        </w:tc>
-      </w:tr>
-      <w:tr>
-        <w:tc>
-          <w:tcPr>
-            <w:tcW w:type="dxa" w:w="3300"/>
-            <w:tcMar>
-              <w:top w:type="dxa" w:w="80"/>
-              <w:left w:type="dxa" w:w="100"/>
-              <w:bottom w:type="dxa" w:w="80"/>
-              <w:right w:type="dxa" w:w="100"/>
-            </w:tcMar>
-          </w:tcPr>
-          <w:p>
-            <w:r>
-              <w:rPr>
-                <w:b w:val="false"/>
-                <w:bCs w:val="false"/>
-                <w:color w:val="000000"/>
-                <w:sz w:val="20"/>
-                <w:szCs w:val="20"/>
-              </w:rPr>
-              <w:t xml:space="preserve">[On Track / At Risk / Blocked]</w:t>
-            </w:r>
-          </w:p>
-        </w:tc>
-        <w:tc>
-          <w:tcPr>
-            <w:tcW w:type="dxa" w:w="2500"/>
-            <w:tcMar>
-              <w:top w:type="dxa" w:w="80"/>
-              <w:left w:type="dxa" w:w="100"/>
-              <w:bottom w:type="dxa" w:w="80"/>
-              <w:right w:type="dxa" w:w="100"/>
-            </w:tcMar>
-          </w:tcPr>
-          <w:p>
-            <w:r>
-              <w:rPr>
-                <w:b w:val="false"/>
-                <w:bCs w:val="false"/>
-                <w:color w:val="000000"/>
-                <w:sz w:val="20"/>
-                <w:szCs w:val="20"/>
-              </w:rPr>
-              <w:t xml:space="preserve">[Yes / No]</w:t>
-            </w:r>
-          </w:p>
-        </w:tc>
-        <w:tc>
-          <w:tcPr>
-            <w:tcW w:type="dxa" w:w="3550"/>
-            <w:tcMar>
-              <w:top w:type="dxa" w:w="80"/>
-              <w:left w:type="dxa" w:w="100"/>
-              <w:bottom w:type="dxa" w:w="80"/>
-              <w:right w:type="dxa" w:w="100"/>
-            </w:tcMar>
-          </w:tcPr>
-          <w:p>
-            <w:r>
-              <w:rPr>
-                <w:b w:val="false"/>
-                <w:bCs w:val="false"/>
-                <w:color w:val="000000"/>
-                <w:sz w:val="20"/>
-                <w:szCs w:val="20"/>
-              </w:rPr>
-              <w:t xml:space="preserve">[brief comment]</w:t>
-            </w:r>
-          </w:p>
-        </w:tc>
-      </w:tr>
-    </w:tbl>
-    <w:p>
-      <w:pPr>
-        <w:spacing w:after="160"/>
-      </w:pPr>
-    </w:p>
-    <w:p>
-      <w:pPr>
-        <w:pStyle w:val="Heading2"/>
-        <w:spacing w:after="120" w:before="320"/>
-      </w:pPr>
-      <w:r>
-        <w:rPr>
-          <w:color w:val="2E5395"/>
-        </w:rPr>
         <w:t xml:space="preserve">10. Next Steps</w:t>
       </w:r>
     </w:p>
     <w:p>
       <w:pPr>
-        <w:shd w:fill="F2F2F2" w:val="clear"/>
-        <w:spacing w:after="160"/>
-      </w:pPr>
-      <w:r>
-        <w:rPr>
-          <w:i/>
-          <w:iCs/>
-          <w:color w:val="808080"/>
-          <w:sz w:val="21"/>
-          <w:szCs w:val="21"/>
-        </w:rPr>
-        <w:t xml:space="preserve">[Confirm readiness to move into Phase 2 (Cleaning &amp; Quality Filtering Pipeline), and note any carry-over work, open questions, or scope changes for the next phase.]</w:t>
+        <w:spacing w:after="140"/>
+      </w:pPr>
+      <w:r>
+        <w:rPr>
+          <w:sz w:val="22"/>
+          <w:szCs w:val="22"/>
+        </w:rPr>
+        <w:t xml:space="preserve">Ready to start Phase 2 (Cleaning &amp; Quality Filtering Pipeline). The raw dataset is in data/raw/ in the agreed schema (doc_id, text, source).</w:t>
+      </w:r>
+    </w:p>
+    <w:p>
+      <w:pPr>
+        <w:spacing w:after="140"/>
+      </w:pPr>
+      <w:r>
+        <w:rPr>
+          <w:sz w:val="22"/>
+          <w:szCs w:val="22"/>
+        </w:rPr>
+        <w:t xml:space="preserve">Carry-over: compute the baseline character and token counts for the raw dataset (Phase 2 starting point), decide whether to scale the corpus beyond 20,000 documents before the training phase, and push the updated spark_session.py and README progress to GitHub.</w:t>
       </w:r>
     </w:p>
     <w:sectPr>

</xml_diff>

<commit_message>
Completed Phase 2 : Cleaning and filtering
</commit_message>
<xml_diff>
--- a/reports/Phase1_Report.docx
+++ b/reports/Phase1_Report.docx
@@ -1015,7 +1015,7 @@
                 <w:sz w:val="20"/>
                 <w:szCs w:val="20"/>
               </w:rPr>
-              <w:t xml:space="preserve">Not yet measured</w:t>
+              <w:t xml:space="preserve">43.43 MB of text; ~10.86M tokens (estimated)</w:t>
             </w:r>
           </w:p>
         </w:tc>
@@ -1038,7 +1038,7 @@
                 <w:sz w:val="20"/>
                 <w:szCs w:val="20"/>
               </w:rPr>
-              <w:t xml:space="preserve">To be computed as the baseline at the start of Phase 2</w:t>
+              <w:t xml:space="preserve">Measured at the start of Phase 2 with baseline_stats.py; tokens estimated as characters / 4</w:t>
             </w:r>
           </w:p>
         </w:tc>
@@ -1512,7 +1512,7 @@
           <w:sz w:val="22"/>
           <w:szCs w:val="22"/>
         </w:rPr>
-        <w:t xml:space="preserve">Carry-over: compute the baseline character and token counts for the raw dataset (Phase 2 starting point), decide whether to scale the corpus beyond 20,000 documents before the training phase, and push the updated spark_session.py and README progress to GitHub.</w:t>
+        <w:t xml:space="preserve">Carry-over: decide whether to scale the corpus beyond 20,000 documents before the training phase. (The baseline character and token counts were measured at the start of Phase 2: 43.43 MB and about 10.86M estimated tokens.)</w:t>
       </w:r>
     </w:p>
     <w:sectPr>

</xml_diff>